<commit_message>
chg: Added JFC D&G and VID Intsum for D4.
</commit_message>
<xml_diff>
--- a/INTELLIGENCE/VID/WIP/OPAC VID INTSUM D3.docx
+++ b/INTELLIGENCE/VID/WIP/OPAC VID INTSUM D3.docx
@@ -269,7 +269,7 @@
         <w:rPr>
           <w:lang w:val="en-US"/>
         </w:rPr>
-        <w:t>During D2 Notian and Xilong officials have continued talks. Credible reporting indicate that Xilong have reassured Notian officials and informed that they have started support and a military to military cooperation is underway.</w:t>
+        <w:t xml:space="preserve">During D3 Notian and Xilong officials have continued their talks. Xilong have expressed that they will support with air and air defence assets for the military-military cooperation that have started. </w:t>
       </w:r>
     </w:p>
     <w:p>
@@ -332,19 +332,49 @@
         <w:rPr>
           <w:lang w:val="en-US"/>
         </w:rPr>
-        <w:t xml:space="preserve">. It is EVEN CHANCE that Xilong will </w:t>
-      </w:r>
-      <w:r>
-        <w:rPr>
-          <w:lang w:val="en-US"/>
-        </w:rPr>
-        <w:t>continue moving air assets into Notia during D3</w:t>
-      </w:r>
-      <w:r>
-        <w:rPr>
-          <w:lang w:val="en-US"/>
-        </w:rPr>
-        <w:t>. It is HIGHLY LIKELY that Xilong will support Notia and prevent the Notian regime from collapsing.</w:t>
+        <w:t xml:space="preserve"> and have continued on D3</w:t>
+      </w:r>
+      <w:r>
+        <w:rPr>
+          <w:lang w:val="en-US"/>
+        </w:rPr>
+        <w:t>. It is</w:t>
+      </w:r>
+      <w:r>
+        <w:rPr>
+          <w:lang w:val="en-US"/>
+        </w:rPr>
+        <w:t xml:space="preserve"> LIKELY</w:t>
+      </w:r>
+      <w:r>
+        <w:rPr>
+          <w:lang w:val="en-US"/>
+        </w:rPr>
+        <w:t xml:space="preserve"> that Xilong will </w:t>
+      </w:r>
+      <w:r>
+        <w:rPr>
+          <w:lang w:val="en-US"/>
+        </w:rPr>
+        <w:t>continue moving</w:t>
+      </w:r>
+      <w:r>
+        <w:rPr>
+          <w:lang w:val="en-US"/>
+        </w:rPr>
+        <w:t xml:space="preserve"> air assets into Notia during D4</w:t>
+      </w:r>
+      <w:r>
+        <w:rPr>
+          <w:lang w:val="en-US"/>
+        </w:rPr>
+        <w:t xml:space="preserve">. </w:t>
+      </w:r>
+      <w:r>
+        <w:rPr>
+          <w:lang w:val="en-US"/>
+        </w:rPr>
+        <w:t>It is EVEN CHANCE that Xilong will start moving air defence units the coming days.</w:t>
       </w:r>
     </w:p>
     <w:p>
@@ -354,77 +384,69 @@
           <w:lang w:val="en-US"/>
         </w:rPr>
       </w:pPr>
+      <w:r>
+        <w:rPr>
+          <w:lang w:val="en-US"/>
+        </w:rPr>
+        <w:t>It is HIGHLY LIKELY that Xilong will support Notia and prevent the Notian regime from collapsing.</w:t>
+      </w:r>
     </w:p>
     <w:p>
       <w:pPr>
-        <w:pStyle w:val="Overskrift2"/>
-        <w:rPr>
-          <w:lang w:val="en-US"/>
-        </w:rPr>
-      </w:pPr>
-      <w:r>
-        <w:rPr>
-          <w:lang w:val="en-US"/>
-        </w:rPr>
-        <w:t>Ground</w:t>
-      </w:r>
+        <w:pStyle w:val="Ingenmellomrom"/>
+        <w:rPr>
+          <w:lang w:val="en-US"/>
+        </w:rPr>
+      </w:pPr>
     </w:p>
     <w:p>
       <w:pPr>
-        <w:pStyle w:val="Overskrift3"/>
-        <w:rPr>
-          <w:lang w:val="en-US"/>
-        </w:rPr>
-      </w:pPr>
-      <w:r>
-        <w:rPr>
-          <w:lang w:val="en-US"/>
-        </w:rPr>
-        <w:t>Notian factories and surge operations</w:t>
-      </w:r>
+        <w:pStyle w:val="Ingenmellomrom"/>
+        <w:rPr>
+          <w:lang w:val="en-US"/>
+        </w:rPr>
+      </w:pPr>
     </w:p>
     <w:p>
       <w:pPr>
-        <w:pStyle w:val="Ingenmellomrom"/>
-        <w:rPr>
-          <w:lang w:val="en-US"/>
-        </w:rPr>
-      </w:pPr>
-      <w:r>
-        <w:rPr>
-          <w:lang w:val="en-US"/>
-        </w:rPr>
-        <w:t xml:space="preserve">VID have credible reporting indicating that Notia are in the final stages of issuing </w:t>
-      </w:r>
-      <w:r>
-        <w:rPr>
-          <w:lang w:val="en-US"/>
-        </w:rPr>
-        <w:t>surge order for Notian factories</w:t>
+        <w:pStyle w:val="Overskrift2"/>
+        <w:rPr>
+          <w:lang w:val="en-US"/>
+        </w:rPr>
+      </w:pPr>
+      <w:r>
+        <w:rPr>
+          <w:lang w:val="en-US"/>
+        </w:rPr>
+        <w:t>Ground</w:t>
       </w:r>
     </w:p>
     <w:p>
       <w:pPr>
-        <w:pStyle w:val="Ingenmellomrom"/>
-        <w:rPr>
-          <w:lang w:val="en-US"/>
-        </w:rPr>
-      </w:pPr>
+        <w:pStyle w:val="Overskrift3"/>
+        <w:rPr>
+          <w:lang w:val="en-US"/>
+        </w:rPr>
+      </w:pPr>
+      <w:r>
+        <w:rPr>
+          <w:lang w:val="en-US"/>
+        </w:rPr>
+        <w:t>Sborka ready on D2</w:t>
+      </w:r>
     </w:p>
     <w:p>
       <w:pPr>
         <w:pStyle w:val="Ingenmellomrom"/>
         <w:rPr>
-          <w:b/>
-          <w:lang w:val="en-US"/>
-        </w:rPr>
-      </w:pPr>
-      <w:r>
-        <w:rPr>
-          <w:b/>
-          <w:lang w:val="en-US"/>
-        </w:rPr>
-        <w:t>ASSESSMENT:</w:t>
+          <w:lang w:val="en-US"/>
+        </w:rPr>
+      </w:pPr>
+      <w:r>
+        <w:rPr>
+          <w:lang w:val="en-US"/>
+        </w:rPr>
+        <w:t>VID reporting indicate 1x Sborka radar was completed on D2 from SRNTGT073 Apatite Radar Factory.</w:t>
       </w:r>
     </w:p>
     <w:p>
@@ -434,18 +456,6 @@
           <w:lang w:val="en-US"/>
         </w:rPr>
       </w:pPr>
-      <w:r>
-        <w:rPr>
-          <w:lang w:val="en-US"/>
-        </w:rPr>
-        <w:t xml:space="preserve">With a </w:t>
-      </w:r>
-      <w:r>
-        <w:rPr>
-          <w:lang w:val="en-US"/>
-        </w:rPr>
-        <w:t>surge order, the factories in Notia will  likely run 24 hours on double shifts, doubling their production.</w:t>
-      </w:r>
     </w:p>
     <w:p>
       <w:pPr>
@@ -457,17 +467,19 @@
     </w:p>
     <w:p>
       <w:pPr>
-        <w:pStyle w:val="Overskrift3"/>
-        <w:rPr>
-          <w:lang w:val="en-US"/>
-        </w:rPr>
-      </w:pPr>
-      <w:r>
-        <w:rPr>
+        <w:pStyle w:val="Ingenmellomrom"/>
+        <w:rPr>
+          <w:b/>
+          <w:lang w:val="en-US"/>
+        </w:rPr>
+      </w:pPr>
+      <w:r>
+        <w:rPr>
+          <w:b/>
           <w:lang w:val="en-US"/>
         </w:rPr>
         <w:lastRenderedPageBreak/>
-        <w:t>SA-6 SAM ready by D4</w:t>
+        <w:t xml:space="preserve">ASSESSMENT: </w:t>
       </w:r>
     </w:p>
     <w:p>
@@ -481,7 +493,20 @@
         <w:rPr>
           <w:lang w:val="en-US"/>
         </w:rPr>
-        <w:t>Credible reporting within Notia indicate that SA-6 launchers are ready by D4 from SRNTGT097 Olenogorsk SAM factory. This is coupled with reporting on SRNTGT073 Apatite Radar Factory that a SA-6 STR is also ready on D4.</w:t>
+        <w:t>With reporting of 2x SA-15, 2x SA-8</w:t>
+      </w:r>
+      <w:r>
+        <w:rPr>
+          <w:rStyle w:val="Fotnotereferanse"/>
+          <w:lang w:val="en-US"/>
+        </w:rPr>
+        <w:footnoteReference w:id="2"/>
+      </w:r>
+      <w:r>
+        <w:rPr>
+          <w:lang w:val="en-US"/>
+        </w:rPr>
+        <w:t xml:space="preserve"> and 1x Sborka completed by D2 it is assessed that Notia can re-inforce current SA-8 and SA-15 battalions in the Air Defence Regiments. VID have no reporting indicating it already happening.</w:t>
       </w:r>
     </w:p>
     <w:p>
@@ -494,26 +519,54 @@
     </w:p>
     <w:p>
       <w:pPr>
-        <w:pStyle w:val="Ingenmellomrom"/>
-        <w:rPr>
-          <w:lang w:val="en-US"/>
-        </w:rPr>
-      </w:pPr>
+        <w:pStyle w:val="Overskrift3"/>
+        <w:rPr>
+          <w:lang w:val="en-US"/>
+        </w:rPr>
+      </w:pPr>
+      <w:r>
+        <w:rPr>
+          <w:lang w:val="en-US"/>
+        </w:rPr>
+        <w:t>SA-11 BN ready by D5</w:t>
+      </w:r>
     </w:p>
     <w:p>
       <w:pPr>
         <w:pStyle w:val="Ingenmellomrom"/>
         <w:rPr>
-          <w:b/>
-          <w:lang w:val="en-US"/>
-        </w:rPr>
-      </w:pPr>
-      <w:r>
-        <w:rPr>
-          <w:b/>
-          <w:lang w:val="en-US"/>
-        </w:rPr>
-        <w:t xml:space="preserve">ASSESSMENT: </w:t>
+          <w:lang w:val="en-US"/>
+        </w:rPr>
+      </w:pPr>
+      <w:r>
+        <w:rPr>
+          <w:lang w:val="en-US"/>
+        </w:rPr>
+        <w:t xml:space="preserve">Credible reporting within Notia indicate that SA-11 launchers are ready by D5 from </w:t>
+      </w:r>
+      <w:r>
+        <w:rPr>
+          <w:lang w:val="en-US"/>
+        </w:rPr>
+        <w:t>SRNTGT072 - Apatite SAM Factory</w:t>
+      </w:r>
+      <w:r>
+        <w:rPr>
+          <w:lang w:val="en-US"/>
+        </w:rPr>
+        <w:t xml:space="preserve">. This is coupled with reporting on SRNTGT073 Apatite Radar Factory that a SA-11 SR and a SA-11 C2 veichle from </w:t>
+      </w:r>
+      <w:r>
+        <w:rPr>
+          <w:lang w:val="en-US"/>
+        </w:rPr>
+        <w:t>SRNTGT074 - Apatite West Vehicle Factory</w:t>
+      </w:r>
+      <w:r>
+        <w:rPr>
+          <w:lang w:val="en-US"/>
+        </w:rPr>
+        <w:t xml:space="preserve"> is also ready on D5.</w:t>
       </w:r>
     </w:p>
     <w:p>
@@ -523,39 +576,35 @@
           <w:lang w:val="en-US"/>
         </w:rPr>
       </w:pPr>
-      <w:r>
-        <w:rPr>
-          <w:lang w:val="en-US"/>
-        </w:rPr>
-        <w:t xml:space="preserve">It is LIKELY that Olenogorsk SAM factory have started a surge production to increase the available SA-6 launchers. </w:t>
-      </w:r>
-      <w:r>
-        <w:rPr>
-          <w:lang w:val="en-US"/>
-        </w:rPr>
-        <w:t xml:space="preserve"> With the reported information on SA-6 ready on D-4, it is LIKELY that another battery is ready on D11.</w:t>
-      </w:r>
     </w:p>
     <w:p>
       <w:pPr>
         <w:pStyle w:val="Ingenmellomrom"/>
         <w:rPr>
-          <w:lang w:val="en-US"/>
-        </w:rPr>
-      </w:pPr>
+          <w:b/>
+          <w:lang w:val="en-US"/>
+        </w:rPr>
+      </w:pPr>
+      <w:r>
+        <w:rPr>
+          <w:b/>
+          <w:lang w:val="en-US"/>
+        </w:rPr>
+        <w:t xml:space="preserve">ASSESSMENT: </w:t>
+      </w:r>
     </w:p>
     <w:p>
       <w:pPr>
-        <w:pStyle w:val="Overskrift3"/>
-        <w:rPr>
-          <w:lang w:val="en-US"/>
-        </w:rPr>
-      </w:pPr>
-      <w:r>
-        <w:rPr>
-          <w:lang w:val="en-US"/>
-        </w:rPr>
-        <w:t>SA-14 SAM ready on D2</w:t>
+        <w:pStyle w:val="Ingenmellomrom"/>
+        <w:rPr>
+          <w:lang w:val="en-US"/>
+        </w:rPr>
+      </w:pPr>
+      <w:r>
+        <w:rPr>
+          <w:lang w:val="en-US"/>
+        </w:rPr>
+        <w:t>It is HIGHLY LIKELY that Apatite SAM factory have started a surge production to increase the available SA-11 launchers.  With the reported information on SA-11 ready on D-5, it is LIKELY that another battery is ready on D12.</w:t>
       </w:r>
     </w:p>
     <w:p>
@@ -565,20 +614,20 @@
           <w:lang w:val="en-US"/>
         </w:rPr>
       </w:pPr>
-      <w:r>
-        <w:rPr>
-          <w:lang w:val="en-US"/>
-        </w:rPr>
-        <w:t>VID reporting indicate 2x Sa-15 launchers (SRNTGT071 Apatite Vehicle Factory) and 2x SA-8 (SRNTGT098 Poliarnie SAM factory) have been finished and rolled out of the factory</w:t>
-      </w:r>
     </w:p>
     <w:p>
       <w:pPr>
-        <w:pStyle w:val="Ingenmellomrom"/>
-        <w:rPr>
-          <w:lang w:val="en-US"/>
-        </w:rPr>
-      </w:pPr>
+        <w:pStyle w:val="Overskrift3"/>
+        <w:rPr>
+          <w:lang w:val="en-US"/>
+        </w:rPr>
+      </w:pPr>
+      <w:r>
+        <w:rPr>
+          <w:lang w:val="en-US"/>
+        </w:rPr>
+        <w:t>SA-10 BN ready by D7</w:t>
+      </w:r>
     </w:p>
     <w:p>
       <w:pPr>
@@ -587,35 +636,47 @@
           <w:lang w:val="en-US"/>
         </w:rPr>
       </w:pPr>
+      <w:r>
+        <w:rPr>
+          <w:lang w:val="en-US"/>
+        </w:rPr>
+        <w:t>Credible reporting within Notia indicate that SA-10 are ready by D7 from SRNTGT101: Severomorsk SAM f</w:t>
+      </w:r>
+      <w:r>
+        <w:rPr>
+          <w:lang w:val="en-US"/>
+        </w:rPr>
+        <w:t>actory</w:t>
+      </w:r>
+      <w:r>
+        <w:rPr>
+          <w:lang w:val="en-US"/>
+        </w:rPr>
+        <w:t>. The Severomorsk SAM factory constructs both the launchers and radars needed for a functional SA-10 battalion. Reporting indicate the Severomorsk SAM factory was already under surge conditions.</w:t>
+      </w:r>
     </w:p>
     <w:p>
       <w:pPr>
         <w:pStyle w:val="Ingenmellomrom"/>
         <w:rPr>
-          <w:b/>
-          <w:lang w:val="en-US"/>
-        </w:rPr>
-      </w:pPr>
-      <w:r>
-        <w:rPr>
-          <w:b/>
-          <w:lang w:val="en-US"/>
-        </w:rPr>
-        <w:t xml:space="preserve">ASSESSMENT: </w:t>
-      </w:r>
+          <w:lang w:val="en-US"/>
+        </w:rPr>
+      </w:pPr>
     </w:p>
     <w:p>
       <w:pPr>
         <w:pStyle w:val="Ingenmellomrom"/>
         <w:rPr>
-          <w:lang w:val="en-US"/>
-        </w:rPr>
-      </w:pPr>
-      <w:r>
-        <w:rPr>
-          <w:lang w:val="en-US"/>
-        </w:rPr>
-        <w:t>It is LIKELY with surge production that on D9 another 4x Sa-15 and 4x SA-8 will be completed in the factories.</w:t>
+          <w:b/>
+          <w:lang w:val="en-US"/>
+        </w:rPr>
+      </w:pPr>
+      <w:r>
+        <w:rPr>
+          <w:b/>
+          <w:lang w:val="en-US"/>
+        </w:rPr>
+        <w:t xml:space="preserve">ASSESSMENT: </w:t>
       </w:r>
     </w:p>
     <w:p>
@@ -625,6 +686,24 @@
           <w:lang w:val="en-US"/>
         </w:rPr>
       </w:pPr>
+      <w:r>
+        <w:rPr>
+          <w:lang w:val="en-US"/>
+        </w:rPr>
+        <w:t>It is HIGHLY LIKELY that Severomorsk SAM f</w:t>
+      </w:r>
+      <w:r>
+        <w:rPr>
+          <w:lang w:val="en-US"/>
+        </w:rPr>
+        <w:t>actory</w:t>
+      </w:r>
+      <w:r>
+        <w:rPr>
+          <w:lang w:val="en-US"/>
+        </w:rPr>
+        <w:t xml:space="preserve"> have started a surge production to increase the available SA-10 BN.  With the reported information on SA-10 ready on D-7, it is HIGHLY LIKELY that another battery is ready on D14.</w:t>
+      </w:r>
     </w:p>
     <w:p>
       <w:pPr>
@@ -636,20 +715,66 @@
     </w:p>
     <w:p>
       <w:pPr>
-        <w:pStyle w:val="Overskrift2"/>
-        <w:rPr>
-          <w:lang w:val="en-US"/>
-        </w:rPr>
-      </w:pPr>
-      <w:r>
-        <w:rPr>
-          <w:lang w:val="en-US"/>
-        </w:rPr>
-        <w:t>Air</w:t>
+        <w:pStyle w:val="Ingenmellomrom"/>
+        <w:rPr>
+          <w:lang w:val="en-US"/>
+        </w:rPr>
+      </w:pPr>
+      <w:r>
+        <w:rPr>
+          <w:lang w:val="en-US"/>
+        </w:rPr>
+        <w:t>It is EVEN CHANCE that 2x SA-10 BN are ready by D7. It is HIGHLY LIKELY that 2x SA-10 BN are ready by D14</w:t>
       </w:r>
     </w:p>
     <w:p>
       <w:pPr>
+        <w:pStyle w:val="Ingenmellomrom"/>
+        <w:rPr>
+          <w:lang w:val="en-US"/>
+        </w:rPr>
+      </w:pPr>
+    </w:p>
+    <w:p>
+      <w:pPr>
+        <w:pStyle w:val="Ingenmellomrom"/>
+        <w:rPr>
+          <w:lang w:val="en-US"/>
+        </w:rPr>
+      </w:pPr>
+    </w:p>
+    <w:p>
+      <w:pPr>
+        <w:pStyle w:val="Ingenmellomrom"/>
+        <w:rPr>
+          <w:lang w:val="en-US"/>
+        </w:rPr>
+      </w:pPr>
+    </w:p>
+    <w:p>
+      <w:pPr>
+        <w:pStyle w:val="Ingenmellomrom"/>
+        <w:rPr>
+          <w:lang w:val="en-US"/>
+        </w:rPr>
+      </w:pPr>
+    </w:p>
+    <w:p>
+      <w:pPr>
+        <w:pStyle w:val="Overskrift2"/>
+        <w:rPr>
+          <w:lang w:val="en-US"/>
+        </w:rPr>
+      </w:pPr>
+      <w:r>
+        <w:rPr>
+          <w:lang w:val="en-US"/>
+        </w:rPr>
+        <w:t>Air</w:t>
+      </w:r>
+    </w:p>
+    <w:p>
+      <w:pPr>
         <w:pStyle w:val="Overskrift3"/>
         <w:rPr>
           <w:lang w:val="en-US"/>
@@ -675,7 +800,31 @@
         <w:rPr>
           <w:lang w:val="en-US"/>
         </w:rPr>
-        <w:t xml:space="preserve">During D2.2 VID sensors picked up unknown signals from NORTH/NORTHEAST. </w:t>
+        <w:t xml:space="preserve">During </w:t>
+      </w:r>
+      <w:r>
+        <w:rPr>
+          <w:lang w:val="en-US"/>
+        </w:rPr>
+        <w:t>D3</w:t>
+      </w:r>
+      <w:r>
+        <w:rPr>
+          <w:lang w:val="en-US"/>
+        </w:rPr>
+        <w:t xml:space="preserve"> VID sensors </w:t>
+      </w:r>
+      <w:r>
+        <w:rPr>
+          <w:lang w:val="en-US"/>
+        </w:rPr>
+        <w:t xml:space="preserve">have continued to pick </w:t>
+      </w:r>
+      <w:r>
+        <w:rPr>
+          <w:lang w:val="en-US"/>
+        </w:rPr>
+        <w:t xml:space="preserve">up unknown signals from NORTH/NORTHEAST. </w:t>
       </w:r>
     </w:p>
     <w:p>
@@ -767,7 +916,7 @@
         <w:rPr>
           <w:lang w:val="en-US"/>
         </w:rPr>
-        <w:t>High activity at Notian ports</w:t>
+        <w:t>Notian naval assets have left port</w:t>
       </w:r>
     </w:p>
     <w:p>
@@ -781,7 +930,25 @@
         <w:rPr>
           <w:lang w:val="en-US"/>
         </w:rPr>
-        <w:t xml:space="preserve">The last 24 hours have seen an increased activity in Notian parts. </w:t>
+        <w:t>During D3 VID have verified reporting of Admiral Kuz</w:t>
+      </w:r>
+      <w:r>
+        <w:rPr>
+          <w:lang w:val="en-US"/>
+        </w:rPr>
+        <w:t>nets</w:t>
+      </w:r>
+      <w:r>
+        <w:rPr>
+          <w:lang w:val="en-US"/>
+        </w:rPr>
+        <w:t>ov</w:t>
+      </w:r>
+      <w:r>
+        <w:rPr>
+          <w:lang w:val="en-US"/>
+        </w:rPr>
+        <w:t xml:space="preserve"> have left port. VID have also verified reporting on the cruiser Moskva leaving port. As of now it is unknown how many escorts or support ships have departed together with the large combatants</w:t>
       </w:r>
     </w:p>
     <w:p>
@@ -805,6 +972,7 @@
           <w:b/>
           <w:lang w:val="en-US"/>
         </w:rPr>
+        <w:lastRenderedPageBreak/>
         <w:t>ASSESSMENTS:</w:t>
       </w:r>
     </w:p>
@@ -819,25 +987,7 @@
         <w:rPr>
           <w:lang w:val="en-US"/>
         </w:rPr>
-        <w:t xml:space="preserve">VID assess it as </w:t>
-      </w:r>
-      <w:r>
-        <w:rPr>
-          <w:lang w:val="en-US"/>
-        </w:rPr>
-        <w:t xml:space="preserve">HIGHLY </w:t>
-      </w:r>
-      <w:r>
-        <w:rPr>
-          <w:lang w:val="en-US"/>
-        </w:rPr>
-        <w:t>LIKELY that the Notian fle</w:t>
-      </w:r>
-      <w:r>
-        <w:rPr>
-          <w:lang w:val="en-US"/>
-        </w:rPr>
-        <w:t>et is preparing to get underway within the next 24 hours.</w:t>
+        <w:t>VID assess it as HIGHLY LIKELY that a major naval force have departed port. EVEN CHANCE operating in one or two groups.</w:t>
       </w:r>
     </w:p>
     <w:p>
@@ -928,6 +1078,36 @@
         </w:rPr>
         <w:t>?</w:t>
       </w:r>
+    </w:p>
+    <w:p>
+      <w:pPr>
+        <w:pStyle w:val="Ingenmellomrom"/>
+        <w:numPr>
+          <w:ilvl w:val="0"/>
+          <w:numId w:val="26"/>
+        </w:numPr>
+        <w:rPr>
+          <w:lang w:val="en-US"/>
+        </w:rPr>
+      </w:pPr>
+      <w:r>
+        <w:rPr>
+          <w:lang w:val="en-US"/>
+        </w:rPr>
+        <w:t>How will Notia use its naval assets?</w:t>
+      </w:r>
+    </w:p>
+    <w:p>
+      <w:pPr>
+        <w:pStyle w:val="Ingenmellomrom"/>
+        <w:numPr>
+          <w:ilvl w:val="0"/>
+          <w:numId w:val="26"/>
+        </w:numPr>
+        <w:rPr>
+          <w:lang w:val="en-US"/>
+        </w:rPr>
+      </w:pPr>
     </w:p>
     <w:p>
       <w:pPr>
@@ -1043,6 +1223,25 @@
       </w:pPr>
       <w:r>
         <w:continuationSeparator/>
+      </w:r>
+    </w:p>
+  </w:footnote>
+  <w:footnote w:id="2">
+    <w:p>
+      <w:pPr>
+        <w:pStyle w:val="Fotnotetekst"/>
+      </w:pPr>
+      <w:r>
+        <w:rPr>
+          <w:rStyle w:val="Fotnotereferanse"/>
+        </w:rPr>
+        <w:footnoteRef/>
+      </w:r>
+      <w:r>
+        <w:t xml:space="preserve"> </w:t>
+      </w:r>
+      <w:r>
+        <w:t>OPAC VID INTSUM D2</w:t>
       </w:r>
     </w:p>
   </w:footnote>
@@ -6626,7 +6825,7 @@
 </file>
 
 <file path=customXml/itemProps1.xml><?xml version="1.0" encoding="utf-8"?>
-<ds:datastoreItem xmlns:ds="http://schemas.openxmlformats.org/officeDocument/2006/customXml" ds:itemID="{48BD9373-50B0-4810-8F07-6656A87B9FA6}">
+<ds:datastoreItem xmlns:ds="http://schemas.openxmlformats.org/officeDocument/2006/customXml" ds:itemID="{8AC1CC73-13DA-4545-8ECB-8C53C840E2F3}">
   <ds:schemaRefs>
     <ds:schemaRef ds:uri="http://schemas.openxmlformats.org/officeDocument/2006/bibliography"/>
   </ds:schemaRefs>

</xml_diff>